<commit_message>
letters: give the Arabic runs a Latin companion so slashes and brackets stop printing as boxes
</commit_message>
<xml_diff>
--- a/backend/documents/letter_templates/case_summary.docx
+++ b/backend/documents/letter_templates/case_summary.docx
@@ -8,7 +8,7 @@
       </w:pPr>
       <w:r>
         <w:rPr>
-          <w:rFonts w:ascii="Noto Naskh Arabic" w:hAnsi="Noto Naskh Arabic" w:cs="Noto Naskh Arabic"/>
+          <w:rFonts w:ascii="Noto Serif" w:hAnsi="Noto Serif" w:cs="Noto Naskh Arabic"/>
           <w:sz w:val="22"/>
           <w:rtl/>
         </w:rPr>
@@ -21,7 +21,7 @@
       </w:pPr>
       <w:r>
         <w:rPr>
-          <w:rFonts w:ascii="Noto Naskh Arabic" w:hAnsi="Noto Naskh Arabic" w:cs="Noto Naskh Arabic"/>
+          <w:rFonts w:ascii="Noto Serif" w:hAnsi="Noto Serif" w:cs="Noto Naskh Arabic"/>
           <w:sz w:val="22"/>
           <w:rtl/>
         </w:rPr>
@@ -34,7 +34,7 @@
       </w:pPr>
       <w:r>
         <w:rPr>
-          <w:rFonts w:ascii="Noto Naskh Arabic" w:hAnsi="Noto Naskh Arabic" w:cs="Noto Naskh Arabic"/>
+          <w:rFonts w:ascii="Noto Serif" w:hAnsi="Noto Serif" w:cs="Noto Naskh Arabic"/>
           <w:sz w:val="22"/>
           <w:rtl/>
         </w:rPr>
@@ -47,7 +47,7 @@
       </w:pPr>
       <w:r>
         <w:rPr>
-          <w:rFonts w:ascii="Noto Naskh Arabic" w:hAnsi="Noto Naskh Arabic" w:cs="Noto Naskh Arabic"/>
+          <w:rFonts w:ascii="Noto Serif" w:hAnsi="Noto Serif" w:cs="Noto Naskh Arabic"/>
           <w:sz w:val="22"/>
           <w:rtl/>
         </w:rPr>
@@ -60,7 +60,7 @@
       </w:pPr>
       <w:r>
         <w:rPr>
-          <w:rFonts w:ascii="Noto Naskh Arabic" w:hAnsi="Noto Naskh Arabic" w:cs="Noto Naskh Arabic"/>
+          <w:rFonts w:ascii="Noto Serif" w:hAnsi="Noto Serif" w:cs="Noto Naskh Arabic"/>
           <w:sz w:val="22"/>
           <w:rtl/>
         </w:rPr>
@@ -73,7 +73,7 @@
       </w:pPr>
       <w:r>
         <w:rPr>
-          <w:rFonts w:ascii="Noto Naskh Arabic" w:hAnsi="Noto Naskh Arabic" w:cs="Noto Naskh Arabic"/>
+          <w:rFonts w:ascii="Noto Serif" w:hAnsi="Noto Serif" w:cs="Noto Naskh Arabic"/>
           <w:sz w:val="28"/>
           <w:rtl/>
         </w:rPr>
@@ -102,7 +102,7 @@
             </w:pPr>
             <w:r>
               <w:rPr>
-                <w:rFonts w:ascii="Noto Naskh Arabic" w:hAnsi="Noto Naskh Arabic" w:cs="Noto Naskh Arabic"/>
+                <w:rFonts w:ascii="Noto Serif" w:hAnsi="Noto Serif" w:cs="Noto Naskh Arabic"/>
                 <w:sz w:val="20"/>
                 <w:rtl/>
               </w:rPr>
@@ -120,7 +120,7 @@
             </w:pPr>
             <w:r>
               <w:rPr>
-                <w:rFonts w:ascii="Noto Naskh Arabic" w:hAnsi="Noto Naskh Arabic" w:cs="Noto Naskh Arabic"/>
+                <w:rFonts w:ascii="Noto Serif" w:hAnsi="Noto Serif" w:cs="Noto Naskh Arabic"/>
                 <w:sz w:val="20"/>
                 <w:rtl/>
               </w:rPr>
@@ -140,7 +140,7 @@
             </w:pPr>
             <w:r>
               <w:rPr>
-                <w:rFonts w:ascii="Noto Naskh Arabic" w:hAnsi="Noto Naskh Arabic" w:cs="Noto Naskh Arabic"/>
+                <w:rFonts w:ascii="Noto Serif" w:hAnsi="Noto Serif" w:cs="Noto Naskh Arabic"/>
                 <w:sz w:val="20"/>
                 <w:rtl/>
               </w:rPr>
@@ -158,7 +158,7 @@
             </w:pPr>
             <w:r>
               <w:rPr>
-                <w:rFonts w:ascii="Noto Naskh Arabic" w:hAnsi="Noto Naskh Arabic" w:cs="Noto Naskh Arabic"/>
+                <w:rFonts w:ascii="Noto Serif" w:hAnsi="Noto Serif" w:cs="Noto Naskh Arabic"/>
                 <w:sz w:val="20"/>
                 <w:rtl/>
               </w:rPr>
@@ -178,7 +178,7 @@
             </w:pPr>
             <w:r>
               <w:rPr>
-                <w:rFonts w:ascii="Noto Naskh Arabic" w:hAnsi="Noto Naskh Arabic" w:cs="Noto Naskh Arabic"/>
+                <w:rFonts w:ascii="Noto Serif" w:hAnsi="Noto Serif" w:cs="Noto Naskh Arabic"/>
                 <w:sz w:val="20"/>
                 <w:rtl/>
               </w:rPr>
@@ -196,7 +196,7 @@
             </w:pPr>
             <w:r>
               <w:rPr>
-                <w:rFonts w:ascii="Noto Naskh Arabic" w:hAnsi="Noto Naskh Arabic" w:cs="Noto Naskh Arabic"/>
+                <w:rFonts w:ascii="Noto Serif" w:hAnsi="Noto Serif" w:cs="Noto Naskh Arabic"/>
                 <w:sz w:val="20"/>
                 <w:rtl/>
               </w:rPr>
@@ -216,7 +216,7 @@
             </w:pPr>
             <w:r>
               <w:rPr>
-                <w:rFonts w:ascii="Noto Naskh Arabic" w:hAnsi="Noto Naskh Arabic" w:cs="Noto Naskh Arabic"/>
+                <w:rFonts w:ascii="Noto Serif" w:hAnsi="Noto Serif" w:cs="Noto Naskh Arabic"/>
                 <w:sz w:val="20"/>
                 <w:rtl/>
               </w:rPr>
@@ -234,7 +234,7 @@
             </w:pPr>
             <w:r>
               <w:rPr>
-                <w:rFonts w:ascii="Noto Naskh Arabic" w:hAnsi="Noto Naskh Arabic" w:cs="Noto Naskh Arabic"/>
+                <w:rFonts w:ascii="Noto Serif" w:hAnsi="Noto Serif" w:cs="Noto Naskh Arabic"/>
                 <w:sz w:val="20"/>
                 <w:rtl/>
               </w:rPr>
@@ -254,7 +254,7 @@
             </w:pPr>
             <w:r>
               <w:rPr>
-                <w:rFonts w:ascii="Noto Naskh Arabic" w:hAnsi="Noto Naskh Arabic" w:cs="Noto Naskh Arabic"/>
+                <w:rFonts w:ascii="Noto Serif" w:hAnsi="Noto Serif" w:cs="Noto Naskh Arabic"/>
                 <w:sz w:val="20"/>
                 <w:rtl/>
               </w:rPr>
@@ -272,7 +272,7 @@
             </w:pPr>
             <w:r>
               <w:rPr>
-                <w:rFonts w:ascii="Noto Naskh Arabic" w:hAnsi="Noto Naskh Arabic" w:cs="Noto Naskh Arabic"/>
+                <w:rFonts w:ascii="Noto Serif" w:hAnsi="Noto Serif" w:cs="Noto Naskh Arabic"/>
                 <w:sz w:val="20"/>
                 <w:rtl/>
               </w:rPr>
@@ -292,7 +292,7 @@
             </w:pPr>
             <w:r>
               <w:rPr>
-                <w:rFonts w:ascii="Noto Naskh Arabic" w:hAnsi="Noto Naskh Arabic" w:cs="Noto Naskh Arabic"/>
+                <w:rFonts w:ascii="Noto Serif" w:hAnsi="Noto Serif" w:cs="Noto Naskh Arabic"/>
                 <w:sz w:val="20"/>
                 <w:rtl/>
               </w:rPr>
@@ -310,7 +310,7 @@
             </w:pPr>
             <w:r>
               <w:rPr>
-                <w:rFonts w:ascii="Noto Naskh Arabic" w:hAnsi="Noto Naskh Arabic" w:cs="Noto Naskh Arabic"/>
+                <w:rFonts w:ascii="Noto Serif" w:hAnsi="Noto Serif" w:cs="Noto Naskh Arabic"/>
                 <w:sz w:val="20"/>
                 <w:rtl/>
               </w:rPr>
@@ -330,7 +330,7 @@
             </w:pPr>
             <w:r>
               <w:rPr>
-                <w:rFonts w:ascii="Noto Naskh Arabic" w:hAnsi="Noto Naskh Arabic" w:cs="Noto Naskh Arabic"/>
+                <w:rFonts w:ascii="Noto Serif" w:hAnsi="Noto Serif" w:cs="Noto Naskh Arabic"/>
                 <w:sz w:val="20"/>
                 <w:rtl/>
               </w:rPr>
@@ -348,7 +348,7 @@
             </w:pPr>
             <w:r>
               <w:rPr>
-                <w:rFonts w:ascii="Noto Naskh Arabic" w:hAnsi="Noto Naskh Arabic" w:cs="Noto Naskh Arabic"/>
+                <w:rFonts w:ascii="Noto Serif" w:hAnsi="Noto Serif" w:cs="Noto Naskh Arabic"/>
                 <w:sz w:val="20"/>
                 <w:rtl/>
               </w:rPr>
@@ -368,7 +368,7 @@
             </w:pPr>
             <w:r>
               <w:rPr>
-                <w:rFonts w:ascii="Noto Naskh Arabic" w:hAnsi="Noto Naskh Arabic" w:cs="Noto Naskh Arabic"/>
+                <w:rFonts w:ascii="Noto Serif" w:hAnsi="Noto Serif" w:cs="Noto Naskh Arabic"/>
                 <w:sz w:val="20"/>
                 <w:rtl/>
               </w:rPr>
@@ -386,7 +386,7 @@
             </w:pPr>
             <w:r>
               <w:rPr>
-                <w:rFonts w:ascii="Noto Naskh Arabic" w:hAnsi="Noto Naskh Arabic" w:cs="Noto Naskh Arabic"/>
+                <w:rFonts w:ascii="Noto Serif" w:hAnsi="Noto Serif" w:cs="Noto Naskh Arabic"/>
                 <w:sz w:val="20"/>
                 <w:rtl/>
               </w:rPr>
@@ -406,7 +406,7 @@
             </w:pPr>
             <w:r>
               <w:rPr>
-                <w:rFonts w:ascii="Noto Naskh Arabic" w:hAnsi="Noto Naskh Arabic" w:cs="Noto Naskh Arabic"/>
+                <w:rFonts w:ascii="Noto Serif" w:hAnsi="Noto Serif" w:cs="Noto Naskh Arabic"/>
                 <w:sz w:val="20"/>
                 <w:rtl/>
               </w:rPr>
@@ -424,7 +424,7 @@
             </w:pPr>
             <w:r>
               <w:rPr>
-                <w:rFonts w:ascii="Noto Naskh Arabic" w:hAnsi="Noto Naskh Arabic" w:cs="Noto Naskh Arabic"/>
+                <w:rFonts w:ascii="Noto Serif" w:hAnsi="Noto Serif" w:cs="Noto Naskh Arabic"/>
                 <w:sz w:val="20"/>
                 <w:rtl/>
               </w:rPr>
@@ -444,7 +444,7 @@
             </w:pPr>
             <w:r>
               <w:rPr>
-                <w:rFonts w:ascii="Noto Naskh Arabic" w:hAnsi="Noto Naskh Arabic" w:cs="Noto Naskh Arabic"/>
+                <w:rFonts w:ascii="Noto Serif" w:hAnsi="Noto Serif" w:cs="Noto Naskh Arabic"/>
                 <w:sz w:val="20"/>
                 <w:rtl/>
               </w:rPr>
@@ -462,7 +462,7 @@
             </w:pPr>
             <w:r>
               <w:rPr>
-                <w:rFonts w:ascii="Noto Naskh Arabic" w:hAnsi="Noto Naskh Arabic" w:cs="Noto Naskh Arabic"/>
+                <w:rFonts w:ascii="Noto Serif" w:hAnsi="Noto Serif" w:cs="Noto Naskh Arabic"/>
                 <w:sz w:val="20"/>
                 <w:rtl/>
               </w:rPr>
@@ -482,7 +482,7 @@
             </w:pPr>
             <w:r>
               <w:rPr>
-                <w:rFonts w:ascii="Noto Naskh Arabic" w:hAnsi="Noto Naskh Arabic" w:cs="Noto Naskh Arabic"/>
+                <w:rFonts w:ascii="Noto Serif" w:hAnsi="Noto Serif" w:cs="Noto Naskh Arabic"/>
                 <w:sz w:val="20"/>
                 <w:rtl/>
               </w:rPr>
@@ -500,7 +500,7 @@
             </w:pPr>
             <w:r>
               <w:rPr>
-                <w:rFonts w:ascii="Noto Naskh Arabic" w:hAnsi="Noto Naskh Arabic" w:cs="Noto Naskh Arabic"/>
+                <w:rFonts w:ascii="Noto Serif" w:hAnsi="Noto Serif" w:cs="Noto Naskh Arabic"/>
                 <w:sz w:val="20"/>
                 <w:rtl/>
               </w:rPr>
@@ -520,7 +520,7 @@
             </w:pPr>
             <w:r>
               <w:rPr>
-                <w:rFonts w:ascii="Noto Naskh Arabic" w:hAnsi="Noto Naskh Arabic" w:cs="Noto Naskh Arabic"/>
+                <w:rFonts w:ascii="Noto Serif" w:hAnsi="Noto Serif" w:cs="Noto Naskh Arabic"/>
                 <w:sz w:val="20"/>
                 <w:rtl/>
               </w:rPr>
@@ -538,7 +538,7 @@
             </w:pPr>
             <w:r>
               <w:rPr>
-                <w:rFonts w:ascii="Noto Naskh Arabic" w:hAnsi="Noto Naskh Arabic" w:cs="Noto Naskh Arabic"/>
+                <w:rFonts w:ascii="Noto Serif" w:hAnsi="Noto Serif" w:cs="Noto Naskh Arabic"/>
                 <w:sz w:val="20"/>
                 <w:rtl/>
               </w:rPr>
@@ -555,7 +555,7 @@
       </w:pPr>
       <w:r>
         <w:rPr>
-          <w:rFonts w:ascii="Noto Naskh Arabic" w:hAnsi="Noto Naskh Arabic" w:cs="Noto Naskh Arabic"/>
+          <w:rFonts w:ascii="Noto Serif" w:hAnsi="Noto Serif" w:cs="Noto Naskh Arabic"/>
           <w:sz w:val="24"/>
           <w:rtl/>
         </w:rPr>
@@ -586,7 +586,7 @@
             </w:pPr>
             <w:r>
               <w:rPr>
-                <w:rFonts w:ascii="Noto Naskh Arabic" w:hAnsi="Noto Naskh Arabic" w:cs="Noto Naskh Arabic"/>
+                <w:rFonts w:ascii="Noto Serif" w:hAnsi="Noto Serif" w:cs="Noto Naskh Arabic"/>
                 <w:sz w:val="20"/>
                 <w:rtl/>
               </w:rPr>
@@ -604,7 +604,7 @@
             </w:pPr>
             <w:r>
               <w:rPr>
-                <w:rFonts w:ascii="Noto Naskh Arabic" w:hAnsi="Noto Naskh Arabic" w:cs="Noto Naskh Arabic"/>
+                <w:rFonts w:ascii="Noto Serif" w:hAnsi="Noto Serif" w:cs="Noto Naskh Arabic"/>
                 <w:sz w:val="20"/>
                 <w:rtl/>
               </w:rPr>
@@ -622,7 +622,7 @@
             </w:pPr>
             <w:r>
               <w:rPr>
-                <w:rFonts w:ascii="Noto Naskh Arabic" w:hAnsi="Noto Naskh Arabic" w:cs="Noto Naskh Arabic"/>
+                <w:rFonts w:ascii="Noto Serif" w:hAnsi="Noto Serif" w:cs="Noto Naskh Arabic"/>
                 <w:sz w:val="20"/>
                 <w:rtl/>
               </w:rPr>
@@ -640,7 +640,7 @@
             </w:pPr>
             <w:r>
               <w:rPr>
-                <w:rFonts w:ascii="Noto Naskh Arabic" w:hAnsi="Noto Naskh Arabic" w:cs="Noto Naskh Arabic"/>
+                <w:rFonts w:ascii="Noto Serif" w:hAnsi="Noto Serif" w:cs="Noto Naskh Arabic"/>
                 <w:sz w:val="20"/>
                 <w:rtl/>
               </w:rPr>
@@ -660,7 +660,7 @@
             </w:pPr>
             <w:r>
               <w:rPr>
-                <w:rFonts w:ascii="Noto Naskh Arabic" w:hAnsi="Noto Naskh Arabic" w:cs="Noto Naskh Arabic"/>
+                <w:rFonts w:ascii="Noto Serif" w:hAnsi="Noto Serif" w:cs="Noto Naskh Arabic"/>
                 <w:rtl/>
               </w:rPr>
               <w:t>{%tr for s in steps %}</w:t>
@@ -697,7 +697,7 @@
             </w:pPr>
             <w:r>
               <w:rPr>
-                <w:rFonts w:ascii="Noto Naskh Arabic" w:hAnsi="Noto Naskh Arabic" w:cs="Noto Naskh Arabic"/>
+                <w:rFonts w:ascii="Noto Serif" w:hAnsi="Noto Serif" w:cs="Noto Naskh Arabic"/>
                 <w:sz w:val="20"/>
                 <w:rtl/>
               </w:rPr>
@@ -715,7 +715,7 @@
             </w:pPr>
             <w:r>
               <w:rPr>
-                <w:rFonts w:ascii="Noto Naskh Arabic" w:hAnsi="Noto Naskh Arabic" w:cs="Noto Naskh Arabic"/>
+                <w:rFonts w:ascii="Noto Serif" w:hAnsi="Noto Serif" w:cs="Noto Naskh Arabic"/>
                 <w:sz w:val="20"/>
                 <w:rtl/>
               </w:rPr>
@@ -733,7 +733,7 @@
             </w:pPr>
             <w:r>
               <w:rPr>
-                <w:rFonts w:ascii="Noto Naskh Arabic" w:hAnsi="Noto Naskh Arabic" w:cs="Noto Naskh Arabic"/>
+                <w:rFonts w:ascii="Noto Serif" w:hAnsi="Noto Serif" w:cs="Noto Naskh Arabic"/>
                 <w:sz w:val="20"/>
                 <w:rtl/>
               </w:rPr>
@@ -751,7 +751,7 @@
             </w:pPr>
             <w:r>
               <w:rPr>
-                <w:rFonts w:ascii="Noto Naskh Arabic" w:hAnsi="Noto Naskh Arabic" w:cs="Noto Naskh Arabic"/>
+                <w:rFonts w:ascii="Noto Serif" w:hAnsi="Noto Serif" w:cs="Noto Naskh Arabic"/>
                 <w:sz w:val="20"/>
                 <w:rtl/>
               </w:rPr>
@@ -771,7 +771,7 @@
             </w:pPr>
             <w:r>
               <w:rPr>
-                <w:rFonts w:ascii="Noto Naskh Arabic" w:hAnsi="Noto Naskh Arabic" w:cs="Noto Naskh Arabic"/>
+                <w:rFonts w:ascii="Noto Serif" w:hAnsi="Noto Serif" w:cs="Noto Naskh Arabic"/>
                 <w:rtl/>
               </w:rPr>
               <w:t>{%tr endfor %}</w:t>
@@ -805,7 +805,7 @@
       </w:pPr>
       <w:r>
         <w:rPr>
-          <w:rFonts w:ascii="Noto Naskh Arabic" w:hAnsi="Noto Naskh Arabic" w:cs="Noto Naskh Arabic"/>
+          <w:rFonts w:ascii="Noto Serif" w:hAnsi="Noto Serif" w:cs="Noto Naskh Arabic"/>
           <w:sz w:val="24"/>
           <w:rtl/>
         </w:rPr>
@@ -837,7 +837,7 @@
             </w:pPr>
             <w:r>
               <w:rPr>
-                <w:rFonts w:ascii="Noto Naskh Arabic" w:hAnsi="Noto Naskh Arabic" w:cs="Noto Naskh Arabic"/>
+                <w:rFonts w:ascii="Noto Serif" w:hAnsi="Noto Serif" w:cs="Noto Naskh Arabic"/>
                 <w:sz w:val="20"/>
                 <w:rtl/>
               </w:rPr>
@@ -855,7 +855,7 @@
             </w:pPr>
             <w:r>
               <w:rPr>
-                <w:rFonts w:ascii="Noto Naskh Arabic" w:hAnsi="Noto Naskh Arabic" w:cs="Noto Naskh Arabic"/>
+                <w:rFonts w:ascii="Noto Serif" w:hAnsi="Noto Serif" w:cs="Noto Naskh Arabic"/>
                 <w:sz w:val="20"/>
                 <w:rtl/>
               </w:rPr>
@@ -873,7 +873,7 @@
             </w:pPr>
             <w:r>
               <w:rPr>
-                <w:rFonts w:ascii="Noto Naskh Arabic" w:hAnsi="Noto Naskh Arabic" w:cs="Noto Naskh Arabic"/>
+                <w:rFonts w:ascii="Noto Serif" w:hAnsi="Noto Serif" w:cs="Noto Naskh Arabic"/>
                 <w:sz w:val="20"/>
                 <w:rtl/>
               </w:rPr>
@@ -891,7 +891,7 @@
             </w:pPr>
             <w:r>
               <w:rPr>
-                <w:rFonts w:ascii="Noto Naskh Arabic" w:hAnsi="Noto Naskh Arabic" w:cs="Noto Naskh Arabic"/>
+                <w:rFonts w:ascii="Noto Serif" w:hAnsi="Noto Serif" w:cs="Noto Naskh Arabic"/>
                 <w:sz w:val="20"/>
                 <w:rtl/>
               </w:rPr>
@@ -909,7 +909,7 @@
             </w:pPr>
             <w:r>
               <w:rPr>
-                <w:rFonts w:ascii="Noto Naskh Arabic" w:hAnsi="Noto Naskh Arabic" w:cs="Noto Naskh Arabic"/>
+                <w:rFonts w:ascii="Noto Serif" w:hAnsi="Noto Serif" w:cs="Noto Naskh Arabic"/>
                 <w:sz w:val="20"/>
                 <w:rtl/>
               </w:rPr>
@@ -929,7 +929,7 @@
             </w:pPr>
             <w:r>
               <w:rPr>
-                <w:rFonts w:ascii="Noto Naskh Arabic" w:hAnsi="Noto Naskh Arabic" w:cs="Noto Naskh Arabic"/>
+                <w:rFonts w:ascii="Noto Serif" w:hAnsi="Noto Serif" w:cs="Noto Naskh Arabic"/>
                 <w:rtl/>
               </w:rPr>
               <w:t>{%tr for i in institutes %}</w:t>
@@ -972,7 +972,7 @@
             </w:pPr>
             <w:r>
               <w:rPr>
-                <w:rFonts w:ascii="Noto Naskh Arabic" w:hAnsi="Noto Naskh Arabic" w:cs="Noto Naskh Arabic"/>
+                <w:rFonts w:ascii="Noto Serif" w:hAnsi="Noto Serif" w:cs="Noto Naskh Arabic"/>
                 <w:sz w:val="20"/>
                 <w:rtl/>
               </w:rPr>
@@ -990,7 +990,7 @@
             </w:pPr>
             <w:r>
               <w:rPr>
-                <w:rFonts w:ascii="Noto Naskh Arabic" w:hAnsi="Noto Naskh Arabic" w:cs="Noto Naskh Arabic"/>
+                <w:rFonts w:ascii="Noto Serif" w:hAnsi="Noto Serif" w:cs="Noto Naskh Arabic"/>
                 <w:sz w:val="20"/>
                 <w:rtl/>
               </w:rPr>
@@ -1008,7 +1008,7 @@
             </w:pPr>
             <w:r>
               <w:rPr>
-                <w:rFonts w:ascii="Noto Naskh Arabic" w:hAnsi="Noto Naskh Arabic" w:cs="Noto Naskh Arabic"/>
+                <w:rFonts w:ascii="Noto Serif" w:hAnsi="Noto Serif" w:cs="Noto Naskh Arabic"/>
                 <w:sz w:val="20"/>
                 <w:rtl/>
               </w:rPr>
@@ -1026,7 +1026,7 @@
             </w:pPr>
             <w:r>
               <w:rPr>
-                <w:rFonts w:ascii="Noto Naskh Arabic" w:hAnsi="Noto Naskh Arabic" w:cs="Noto Naskh Arabic"/>
+                <w:rFonts w:ascii="Noto Serif" w:hAnsi="Noto Serif" w:cs="Noto Naskh Arabic"/>
                 <w:sz w:val="20"/>
                 <w:rtl/>
               </w:rPr>
@@ -1044,7 +1044,7 @@
             </w:pPr>
             <w:r>
               <w:rPr>
-                <w:rFonts w:ascii="Noto Naskh Arabic" w:hAnsi="Noto Naskh Arabic" w:cs="Noto Naskh Arabic"/>
+                <w:rFonts w:ascii="Noto Serif" w:hAnsi="Noto Serif" w:cs="Noto Naskh Arabic"/>
                 <w:sz w:val="20"/>
                 <w:rtl/>
               </w:rPr>
@@ -1064,7 +1064,7 @@
             </w:pPr>
             <w:r>
               <w:rPr>
-                <w:rFonts w:ascii="Noto Naskh Arabic" w:hAnsi="Noto Naskh Arabic" w:cs="Noto Naskh Arabic"/>
+                <w:rFonts w:ascii="Noto Serif" w:hAnsi="Noto Serif" w:cs="Noto Naskh Arabic"/>
                 <w:rtl/>
               </w:rPr>
               <w:t>{%tr endfor %}</w:t>
@@ -1195,7 +1195,7 @@
         <w:ind w:left="1440" w:hanging="360"/>
       </w:pPr>
       <w:rPr>
-        <w:rFonts w:ascii="Symbol" w:hAnsi="Symbol" w:hint="default"/>
+        <w:rFonts w:ascii="Noto Serif" w:hAnsi="Noto Serif" w:hint="default"/>
       </w:rPr>
     </w:lvl>
   </w:abstractNum>
@@ -1216,7 +1216,7 @@
         <w:ind w:left="1080" w:hanging="360"/>
       </w:pPr>
       <w:rPr>
-        <w:rFonts w:ascii="Symbol" w:hAnsi="Symbol" w:hint="default"/>
+        <w:rFonts w:ascii="Noto Serif" w:hAnsi="Noto Serif" w:hint="default"/>
       </w:rPr>
     </w:lvl>
   </w:abstractNum>
@@ -1237,7 +1237,7 @@
         <w:ind w:left="720" w:hanging="360"/>
       </w:pPr>
       <w:rPr>
-        <w:rFonts w:ascii="Symbol" w:hAnsi="Symbol" w:hint="default"/>
+        <w:rFonts w:ascii="Noto Serif" w:hAnsi="Noto Serif" w:hint="default"/>
       </w:rPr>
     </w:lvl>
   </w:abstractNum>
@@ -1276,7 +1276,7 @@
         <w:ind w:left="360" w:hanging="360"/>
       </w:pPr>
       <w:rPr>
-        <w:rFonts w:ascii="Symbol" w:hAnsi="Symbol" w:hint="default"/>
+        <w:rFonts w:ascii="Noto Serif" w:hAnsi="Noto Serif" w:hint="default"/>
       </w:rPr>
     </w:lvl>
   </w:abstractNum>
@@ -1315,7 +1315,7 @@
   <w:docDefaults>
     <w:rPrDefault>
       <w:rPr>
-        <w:rFonts w:asciiTheme="minorHAnsi" w:eastAsiaTheme="minorEastAsia" w:hAnsiTheme="minorHAnsi" w:cstheme="minorBidi"/>
+        <w:rFonts w:hAnsi="Noto Serif" w:ascii="Noto Serif" w:eastAsiaTheme="minorEastAsia" w:cstheme="minorBidi"/>
         <w:sz w:val="22"/>
         <w:szCs w:val="22"/>
         <w:lang w:val="en-US" w:eastAsia="en-US" w:bidi="ar-SA"/>
@@ -1533,7 +1533,7 @@
       <w:outlineLvl w:val="0"/>
     </w:pPr>
     <w:rPr>
-      <w:rFonts w:asciiTheme="majorHAnsi" w:eastAsiaTheme="majorEastAsia" w:hAnsiTheme="majorHAnsi" w:cstheme="majorBidi"/>
+      <w:rFonts w:hAnsi="Noto Serif" w:ascii="Noto Serif" w:eastAsiaTheme="majorEastAsia" w:cstheme="majorBidi"/>
       <w:b/>
       <w:bCs/>
       <w:color w:val="365F91" w:themeColor="accent1" w:themeShade="BF"/>
@@ -1557,7 +1557,7 @@
       <w:outlineLvl w:val="1"/>
     </w:pPr>
     <w:rPr>
-      <w:rFonts w:asciiTheme="majorHAnsi" w:eastAsiaTheme="majorEastAsia" w:hAnsiTheme="majorHAnsi" w:cstheme="majorBidi"/>
+      <w:rFonts w:hAnsi="Noto Serif" w:ascii="Noto Serif" w:eastAsiaTheme="majorEastAsia" w:cstheme="majorBidi"/>
       <w:b/>
       <w:bCs/>
       <w:color w:val="4F81BD" w:themeColor="accent1"/>
@@ -1581,7 +1581,7 @@
       <w:outlineLvl w:val="2"/>
     </w:pPr>
     <w:rPr>
-      <w:rFonts w:asciiTheme="majorHAnsi" w:eastAsiaTheme="majorEastAsia" w:hAnsiTheme="majorHAnsi" w:cstheme="majorBidi"/>
+      <w:rFonts w:hAnsi="Noto Serif" w:ascii="Noto Serif" w:eastAsiaTheme="majorEastAsia" w:cstheme="majorBidi"/>
       <w:b/>
       <w:bCs/>
       <w:color w:val="4F81BD" w:themeColor="accent1"/>
@@ -1604,7 +1604,7 @@
       <w:outlineLvl w:val="3"/>
     </w:pPr>
     <w:rPr>
-      <w:rFonts w:asciiTheme="majorHAnsi" w:eastAsiaTheme="majorEastAsia" w:hAnsiTheme="majorHAnsi" w:cstheme="majorBidi"/>
+      <w:rFonts w:hAnsi="Noto Serif" w:ascii="Noto Serif" w:eastAsiaTheme="majorEastAsia" w:cstheme="majorBidi"/>
       <w:b/>
       <w:bCs/>
       <w:i/>
@@ -1629,7 +1629,7 @@
       <w:outlineLvl w:val="4"/>
     </w:pPr>
     <w:rPr>
-      <w:rFonts w:asciiTheme="majorHAnsi" w:eastAsiaTheme="majorEastAsia" w:hAnsiTheme="majorHAnsi" w:cstheme="majorBidi"/>
+      <w:rFonts w:hAnsi="Noto Serif" w:ascii="Noto Serif" w:eastAsiaTheme="majorEastAsia" w:cstheme="majorBidi"/>
       <w:color w:val="243F60" w:themeColor="accent1" w:themeShade="7F"/>
     </w:rPr>
   </w:style>
@@ -1650,7 +1650,7 @@
       <w:outlineLvl w:val="5"/>
     </w:pPr>
     <w:rPr>
-      <w:rFonts w:asciiTheme="majorHAnsi" w:eastAsiaTheme="majorEastAsia" w:hAnsiTheme="majorHAnsi" w:cstheme="majorBidi"/>
+      <w:rFonts w:hAnsi="Noto Serif" w:ascii="Noto Serif" w:eastAsiaTheme="majorEastAsia" w:cstheme="majorBidi"/>
       <w:i/>
       <w:iCs/>
       <w:color w:val="243F60" w:themeColor="accent1" w:themeShade="7F"/>
@@ -1673,7 +1673,7 @@
       <w:outlineLvl w:val="6"/>
     </w:pPr>
     <w:rPr>
-      <w:rFonts w:asciiTheme="majorHAnsi" w:eastAsiaTheme="majorEastAsia" w:hAnsiTheme="majorHAnsi" w:cstheme="majorBidi"/>
+      <w:rFonts w:hAnsi="Noto Serif" w:ascii="Noto Serif" w:eastAsiaTheme="majorEastAsia" w:cstheme="majorBidi"/>
       <w:i/>
       <w:iCs/>
       <w:color w:val="404040" w:themeColor="text1" w:themeTint="BF"/>
@@ -1696,7 +1696,7 @@
       <w:outlineLvl w:val="7"/>
     </w:pPr>
     <w:rPr>
-      <w:rFonts w:asciiTheme="majorHAnsi" w:eastAsiaTheme="majorEastAsia" w:hAnsiTheme="majorHAnsi" w:cstheme="majorBidi"/>
+      <w:rFonts w:hAnsi="Noto Serif" w:ascii="Noto Serif" w:eastAsiaTheme="majorEastAsia" w:cstheme="majorBidi"/>
       <w:color w:val="4F81BD" w:themeColor="accent1"/>
       <w:sz w:val="20"/>
       <w:szCs w:val="20"/>
@@ -1719,7 +1719,7 @@
       <w:outlineLvl w:val="8"/>
     </w:pPr>
     <w:rPr>
-      <w:rFonts w:asciiTheme="majorHAnsi" w:eastAsiaTheme="majorEastAsia" w:hAnsiTheme="majorHAnsi" w:cstheme="majorBidi"/>
+      <w:rFonts w:hAnsi="Noto Serif" w:ascii="Noto Serif" w:eastAsiaTheme="majorEastAsia" w:cstheme="majorBidi"/>
       <w:i/>
       <w:iCs/>
       <w:color w:val="404040" w:themeColor="text1" w:themeTint="BF"/>
@@ -1770,7 +1770,7 @@
     <w:uiPriority w:val="9"/>
     <w:rsid w:val="00FC693F"/>
     <w:rPr>
-      <w:rFonts w:asciiTheme="majorHAnsi" w:eastAsiaTheme="majorEastAsia" w:hAnsiTheme="majorHAnsi" w:cstheme="majorBidi"/>
+      <w:rFonts w:hAnsi="Noto Serif" w:ascii="Noto Serif" w:eastAsiaTheme="majorEastAsia" w:cstheme="majorBidi"/>
       <w:b/>
       <w:bCs/>
       <w:color w:val="365F91" w:themeColor="accent1" w:themeShade="BF"/>
@@ -1785,7 +1785,7 @@
     <w:uiPriority w:val="9"/>
     <w:rsid w:val="00FC693F"/>
     <w:rPr>
-      <w:rFonts w:asciiTheme="majorHAnsi" w:eastAsiaTheme="majorEastAsia" w:hAnsiTheme="majorHAnsi" w:cstheme="majorBidi"/>
+      <w:rFonts w:hAnsi="Noto Serif" w:ascii="Noto Serif" w:eastAsiaTheme="majorEastAsia" w:cstheme="majorBidi"/>
       <w:b/>
       <w:bCs/>
       <w:color w:val="4F81BD" w:themeColor="accent1"/>
@@ -1800,7 +1800,7 @@
     <w:uiPriority w:val="9"/>
     <w:rsid w:val="00FC693F"/>
     <w:rPr>
-      <w:rFonts w:asciiTheme="majorHAnsi" w:eastAsiaTheme="majorEastAsia" w:hAnsiTheme="majorHAnsi" w:cstheme="majorBidi"/>
+      <w:rFonts w:hAnsi="Noto Serif" w:ascii="Noto Serif" w:eastAsiaTheme="majorEastAsia" w:cstheme="majorBidi"/>
       <w:b/>
       <w:bCs/>
       <w:color w:val="4F81BD" w:themeColor="accent1"/>
@@ -1822,7 +1822,7 @@
       <w:contextualSpacing/>
     </w:pPr>
     <w:rPr>
-      <w:rFonts w:asciiTheme="majorHAnsi" w:eastAsiaTheme="majorEastAsia" w:hAnsiTheme="majorHAnsi" w:cstheme="majorBidi"/>
+      <w:rFonts w:hAnsi="Noto Serif" w:ascii="Noto Serif" w:eastAsiaTheme="majorEastAsia" w:cstheme="majorBidi"/>
       <w:color w:val="17365D" w:themeColor="text2" w:themeShade="BF"/>
       <w:spacing w:val="5"/>
       <w:kern w:val="28"/>
@@ -1837,7 +1837,7 @@
     <w:uiPriority w:val="10"/>
     <w:rsid w:val="00FC693F"/>
     <w:rPr>
-      <w:rFonts w:asciiTheme="majorHAnsi" w:eastAsiaTheme="majorEastAsia" w:hAnsiTheme="majorHAnsi" w:cstheme="majorBidi"/>
+      <w:rFonts w:hAnsi="Noto Serif" w:ascii="Noto Serif" w:eastAsiaTheme="majorEastAsia" w:cstheme="majorBidi"/>
       <w:color w:val="17365D" w:themeColor="text2" w:themeShade="BF"/>
       <w:spacing w:val="5"/>
       <w:kern w:val="28"/>
@@ -1859,7 +1859,7 @@
       </w:numPr>
     </w:pPr>
     <w:rPr>
-      <w:rFonts w:asciiTheme="majorHAnsi" w:eastAsiaTheme="majorEastAsia" w:hAnsiTheme="majorHAnsi" w:cstheme="majorBidi"/>
+      <w:rFonts w:hAnsi="Noto Serif" w:ascii="Noto Serif" w:eastAsiaTheme="majorEastAsia" w:cstheme="majorBidi"/>
       <w:i/>
       <w:iCs/>
       <w:color w:val="4F81BD" w:themeColor="accent1"/>
@@ -1875,7 +1875,7 @@
     <w:uiPriority w:val="11"/>
     <w:rsid w:val="00FC693F"/>
     <w:rPr>
-      <w:rFonts w:asciiTheme="majorHAnsi" w:eastAsiaTheme="majorEastAsia" w:hAnsiTheme="majorHAnsi" w:cstheme="majorBidi"/>
+      <w:rFonts w:hAnsi="Noto Serif" w:ascii="Noto Serif" w:eastAsiaTheme="majorEastAsia" w:cstheme="majorBidi"/>
       <w:i/>
       <w:iCs/>
       <w:color w:val="4F81BD" w:themeColor="accent1"/>
@@ -2122,7 +2122,7 @@
       </w:tabs>
     </w:pPr>
     <w:rPr>
-      <w:rFonts w:ascii="Courier" w:hAnsi="Courier"/>
+      <w:rFonts w:ascii="Noto Serif" w:hAnsi="Noto Serif"/>
       <w:sz w:val="20"/>
       <w:szCs w:val="20"/>
     </w:rPr>
@@ -2134,7 +2134,7 @@
     <w:uiPriority w:val="99"/>
     <w:rsid w:val="0029639D"/>
     <w:rPr>
-      <w:rFonts w:ascii="Courier" w:hAnsi="Courier"/>
+      <w:rFonts w:ascii="Noto Serif" w:hAnsi="Noto Serif"/>
       <w:sz w:val="20"/>
       <w:szCs w:val="20"/>
     </w:rPr>
@@ -2173,7 +2173,7 @@
     <w:semiHidden/>
     <w:rsid w:val="00FC693F"/>
     <w:rPr>
-      <w:rFonts w:asciiTheme="majorHAnsi" w:eastAsiaTheme="majorEastAsia" w:hAnsiTheme="majorHAnsi" w:cstheme="majorBidi"/>
+      <w:rFonts w:hAnsi="Noto Serif" w:ascii="Noto Serif" w:eastAsiaTheme="majorEastAsia" w:cstheme="majorBidi"/>
       <w:b/>
       <w:bCs/>
       <w:i/>
@@ -2189,7 +2189,7 @@
     <w:semiHidden/>
     <w:rsid w:val="00FC693F"/>
     <w:rPr>
-      <w:rFonts w:asciiTheme="majorHAnsi" w:eastAsiaTheme="majorEastAsia" w:hAnsiTheme="majorHAnsi" w:cstheme="majorBidi"/>
+      <w:rFonts w:hAnsi="Noto Serif" w:ascii="Noto Serif" w:eastAsiaTheme="majorEastAsia" w:cstheme="majorBidi"/>
       <w:color w:val="243F60" w:themeColor="accent1" w:themeShade="7F"/>
     </w:rPr>
   </w:style>
@@ -2201,7 +2201,7 @@
     <w:semiHidden/>
     <w:rsid w:val="00FC693F"/>
     <w:rPr>
-      <w:rFonts w:asciiTheme="majorHAnsi" w:eastAsiaTheme="majorEastAsia" w:hAnsiTheme="majorHAnsi" w:cstheme="majorBidi"/>
+      <w:rFonts w:hAnsi="Noto Serif" w:ascii="Noto Serif" w:eastAsiaTheme="majorEastAsia" w:cstheme="majorBidi"/>
       <w:i/>
       <w:iCs/>
       <w:color w:val="243F60" w:themeColor="accent1" w:themeShade="7F"/>
@@ -2215,7 +2215,7 @@
     <w:semiHidden/>
     <w:rsid w:val="00FC693F"/>
     <w:rPr>
-      <w:rFonts w:asciiTheme="majorHAnsi" w:eastAsiaTheme="majorEastAsia" w:hAnsiTheme="majorHAnsi" w:cstheme="majorBidi"/>
+      <w:rFonts w:hAnsi="Noto Serif" w:ascii="Noto Serif" w:eastAsiaTheme="majorEastAsia" w:cstheme="majorBidi"/>
       <w:i/>
       <w:iCs/>
       <w:color w:val="404040" w:themeColor="text1" w:themeTint="BF"/>
@@ -2229,7 +2229,7 @@
     <w:semiHidden/>
     <w:rsid w:val="00FC693F"/>
     <w:rPr>
-      <w:rFonts w:asciiTheme="majorHAnsi" w:eastAsiaTheme="majorEastAsia" w:hAnsiTheme="majorHAnsi" w:cstheme="majorBidi"/>
+      <w:rFonts w:hAnsi="Noto Serif" w:ascii="Noto Serif" w:eastAsiaTheme="majorEastAsia" w:cstheme="majorBidi"/>
       <w:color w:val="4F81BD" w:themeColor="accent1"/>
       <w:sz w:val="20"/>
       <w:szCs w:val="20"/>
@@ -2243,7 +2243,7 @@
     <w:semiHidden/>
     <w:rsid w:val="00FC693F"/>
     <w:rPr>
-      <w:rFonts w:asciiTheme="majorHAnsi" w:eastAsiaTheme="majorEastAsia" w:hAnsiTheme="majorHAnsi" w:cstheme="majorBidi"/>
+      <w:rFonts w:hAnsi="Noto Serif" w:ascii="Noto Serif" w:eastAsiaTheme="majorEastAsia" w:cstheme="majorBidi"/>
       <w:i/>
       <w:iCs/>
       <w:color w:val="404040" w:themeColor="text1" w:themeTint="BF"/>
@@ -3832,7 +3832,7 @@
         <w:spacing w:before="0" w:after="0" w:line="240" w:lineRule="auto"/>
       </w:pPr>
       <w:rPr>
-        <w:rFonts w:asciiTheme="majorHAnsi" w:eastAsiaTheme="majorEastAsia" w:hAnsiTheme="majorHAnsi" w:cstheme="majorBidi"/>
+        <w:rFonts w:hAnsi="Noto Serif" w:ascii="Noto Serif" w:eastAsiaTheme="majorEastAsia" w:cstheme="majorBidi"/>
         <w:b/>
         <w:bCs/>
       </w:rPr>
@@ -3853,7 +3853,7 @@
         <w:spacing w:before="0" w:after="0" w:line="240" w:lineRule="auto"/>
       </w:pPr>
       <w:rPr>
-        <w:rFonts w:asciiTheme="majorHAnsi" w:eastAsiaTheme="majorEastAsia" w:hAnsiTheme="majorHAnsi" w:cstheme="majorBidi"/>
+        <w:rFonts w:hAnsi="Noto Serif" w:ascii="Noto Serif" w:eastAsiaTheme="majorEastAsia" w:cstheme="majorBidi"/>
         <w:b/>
         <w:bCs/>
       </w:rPr>
@@ -3871,14 +3871,14 @@
     </w:tblStylePr>
     <w:tblStylePr w:type="firstCol">
       <w:rPr>
-        <w:rFonts w:asciiTheme="majorHAnsi" w:eastAsiaTheme="majorEastAsia" w:hAnsiTheme="majorHAnsi" w:cstheme="majorBidi"/>
+        <w:rFonts w:hAnsi="Noto Serif" w:ascii="Noto Serif" w:eastAsiaTheme="majorEastAsia" w:cstheme="majorBidi"/>
         <w:b/>
         <w:bCs/>
       </w:rPr>
     </w:tblStylePr>
     <w:tblStylePr w:type="lastCol">
       <w:rPr>
-        <w:rFonts w:asciiTheme="majorHAnsi" w:eastAsiaTheme="majorEastAsia" w:hAnsiTheme="majorHAnsi" w:cstheme="majorBidi"/>
+        <w:rFonts w:hAnsi="Noto Serif" w:ascii="Noto Serif" w:eastAsiaTheme="majorEastAsia" w:cstheme="majorBidi"/>
         <w:b/>
         <w:bCs/>
       </w:rPr>
@@ -3962,7 +3962,7 @@
         <w:spacing w:before="0" w:after="0" w:line="240" w:lineRule="auto"/>
       </w:pPr>
       <w:rPr>
-        <w:rFonts w:asciiTheme="majorHAnsi" w:eastAsiaTheme="majorEastAsia" w:hAnsiTheme="majorHAnsi" w:cstheme="majorBidi"/>
+        <w:rFonts w:hAnsi="Noto Serif" w:ascii="Noto Serif" w:eastAsiaTheme="majorEastAsia" w:cstheme="majorBidi"/>
         <w:b/>
         <w:bCs/>
       </w:rPr>
@@ -3983,7 +3983,7 @@
         <w:spacing w:before="0" w:after="0" w:line="240" w:lineRule="auto"/>
       </w:pPr>
       <w:rPr>
-        <w:rFonts w:asciiTheme="majorHAnsi" w:eastAsiaTheme="majorEastAsia" w:hAnsiTheme="majorHAnsi" w:cstheme="majorBidi"/>
+        <w:rFonts w:hAnsi="Noto Serif" w:ascii="Noto Serif" w:eastAsiaTheme="majorEastAsia" w:cstheme="majorBidi"/>
         <w:b/>
         <w:bCs/>
       </w:rPr>
@@ -4001,14 +4001,14 @@
     </w:tblStylePr>
     <w:tblStylePr w:type="firstCol">
       <w:rPr>
-        <w:rFonts w:asciiTheme="majorHAnsi" w:eastAsiaTheme="majorEastAsia" w:hAnsiTheme="majorHAnsi" w:cstheme="majorBidi"/>
+        <w:rFonts w:hAnsi="Noto Serif" w:ascii="Noto Serif" w:eastAsiaTheme="majorEastAsia" w:cstheme="majorBidi"/>
         <w:b/>
         <w:bCs/>
       </w:rPr>
     </w:tblStylePr>
     <w:tblStylePr w:type="lastCol">
       <w:rPr>
-        <w:rFonts w:asciiTheme="majorHAnsi" w:eastAsiaTheme="majorEastAsia" w:hAnsiTheme="majorHAnsi" w:cstheme="majorBidi"/>
+        <w:rFonts w:hAnsi="Noto Serif" w:ascii="Noto Serif" w:eastAsiaTheme="majorEastAsia" w:cstheme="majorBidi"/>
         <w:b/>
         <w:bCs/>
       </w:rPr>
@@ -4092,7 +4092,7 @@
         <w:spacing w:before="0" w:after="0" w:line="240" w:lineRule="auto"/>
       </w:pPr>
       <w:rPr>
-        <w:rFonts w:asciiTheme="majorHAnsi" w:eastAsiaTheme="majorEastAsia" w:hAnsiTheme="majorHAnsi" w:cstheme="majorBidi"/>
+        <w:rFonts w:hAnsi="Noto Serif" w:ascii="Noto Serif" w:eastAsiaTheme="majorEastAsia" w:cstheme="majorBidi"/>
         <w:b/>
         <w:bCs/>
       </w:rPr>
@@ -4113,7 +4113,7 @@
         <w:spacing w:before="0" w:after="0" w:line="240" w:lineRule="auto"/>
       </w:pPr>
       <w:rPr>
-        <w:rFonts w:asciiTheme="majorHAnsi" w:eastAsiaTheme="majorEastAsia" w:hAnsiTheme="majorHAnsi" w:cstheme="majorBidi"/>
+        <w:rFonts w:hAnsi="Noto Serif" w:ascii="Noto Serif" w:eastAsiaTheme="majorEastAsia" w:cstheme="majorBidi"/>
         <w:b/>
         <w:bCs/>
       </w:rPr>
@@ -4131,14 +4131,14 @@
     </w:tblStylePr>
     <w:tblStylePr w:type="firstCol">
       <w:rPr>
-        <w:rFonts w:asciiTheme="majorHAnsi" w:eastAsiaTheme="majorEastAsia" w:hAnsiTheme="majorHAnsi" w:cstheme="majorBidi"/>
+        <w:rFonts w:hAnsi="Noto Serif" w:ascii="Noto Serif" w:eastAsiaTheme="majorEastAsia" w:cstheme="majorBidi"/>
         <w:b/>
         <w:bCs/>
       </w:rPr>
     </w:tblStylePr>
     <w:tblStylePr w:type="lastCol">
       <w:rPr>
-        <w:rFonts w:asciiTheme="majorHAnsi" w:eastAsiaTheme="majorEastAsia" w:hAnsiTheme="majorHAnsi" w:cstheme="majorBidi"/>
+        <w:rFonts w:hAnsi="Noto Serif" w:ascii="Noto Serif" w:eastAsiaTheme="majorEastAsia" w:cstheme="majorBidi"/>
         <w:b/>
         <w:bCs/>
       </w:rPr>
@@ -4222,7 +4222,7 @@
         <w:spacing w:before="0" w:after="0" w:line="240" w:lineRule="auto"/>
       </w:pPr>
       <w:rPr>
-        <w:rFonts w:asciiTheme="majorHAnsi" w:eastAsiaTheme="majorEastAsia" w:hAnsiTheme="majorHAnsi" w:cstheme="majorBidi"/>
+        <w:rFonts w:hAnsi="Noto Serif" w:ascii="Noto Serif" w:eastAsiaTheme="majorEastAsia" w:cstheme="majorBidi"/>
         <w:b/>
         <w:bCs/>
       </w:rPr>
@@ -4243,7 +4243,7 @@
         <w:spacing w:before="0" w:after="0" w:line="240" w:lineRule="auto"/>
       </w:pPr>
       <w:rPr>
-        <w:rFonts w:asciiTheme="majorHAnsi" w:eastAsiaTheme="majorEastAsia" w:hAnsiTheme="majorHAnsi" w:cstheme="majorBidi"/>
+        <w:rFonts w:hAnsi="Noto Serif" w:ascii="Noto Serif" w:eastAsiaTheme="majorEastAsia" w:cstheme="majorBidi"/>
         <w:b/>
         <w:bCs/>
       </w:rPr>
@@ -4261,14 +4261,14 @@
     </w:tblStylePr>
     <w:tblStylePr w:type="firstCol">
       <w:rPr>
-        <w:rFonts w:asciiTheme="majorHAnsi" w:eastAsiaTheme="majorEastAsia" w:hAnsiTheme="majorHAnsi" w:cstheme="majorBidi"/>
+        <w:rFonts w:hAnsi="Noto Serif" w:ascii="Noto Serif" w:eastAsiaTheme="majorEastAsia" w:cstheme="majorBidi"/>
         <w:b/>
         <w:bCs/>
       </w:rPr>
     </w:tblStylePr>
     <w:tblStylePr w:type="lastCol">
       <w:rPr>
-        <w:rFonts w:asciiTheme="majorHAnsi" w:eastAsiaTheme="majorEastAsia" w:hAnsiTheme="majorHAnsi" w:cstheme="majorBidi"/>
+        <w:rFonts w:hAnsi="Noto Serif" w:ascii="Noto Serif" w:eastAsiaTheme="majorEastAsia" w:cstheme="majorBidi"/>
         <w:b/>
         <w:bCs/>
       </w:rPr>
@@ -4352,7 +4352,7 @@
         <w:spacing w:before="0" w:after="0" w:line="240" w:lineRule="auto"/>
       </w:pPr>
       <w:rPr>
-        <w:rFonts w:asciiTheme="majorHAnsi" w:eastAsiaTheme="majorEastAsia" w:hAnsiTheme="majorHAnsi" w:cstheme="majorBidi"/>
+        <w:rFonts w:hAnsi="Noto Serif" w:ascii="Noto Serif" w:eastAsiaTheme="majorEastAsia" w:cstheme="majorBidi"/>
         <w:b/>
         <w:bCs/>
       </w:rPr>
@@ -4373,7 +4373,7 @@
         <w:spacing w:before="0" w:after="0" w:line="240" w:lineRule="auto"/>
       </w:pPr>
       <w:rPr>
-        <w:rFonts w:asciiTheme="majorHAnsi" w:eastAsiaTheme="majorEastAsia" w:hAnsiTheme="majorHAnsi" w:cstheme="majorBidi"/>
+        <w:rFonts w:hAnsi="Noto Serif" w:ascii="Noto Serif" w:eastAsiaTheme="majorEastAsia" w:cstheme="majorBidi"/>
         <w:b/>
         <w:bCs/>
       </w:rPr>
@@ -4391,14 +4391,14 @@
     </w:tblStylePr>
     <w:tblStylePr w:type="firstCol">
       <w:rPr>
-        <w:rFonts w:asciiTheme="majorHAnsi" w:eastAsiaTheme="majorEastAsia" w:hAnsiTheme="majorHAnsi" w:cstheme="majorBidi"/>
+        <w:rFonts w:hAnsi="Noto Serif" w:ascii="Noto Serif" w:eastAsiaTheme="majorEastAsia" w:cstheme="majorBidi"/>
         <w:b/>
         <w:bCs/>
       </w:rPr>
     </w:tblStylePr>
     <w:tblStylePr w:type="lastCol">
       <w:rPr>
-        <w:rFonts w:asciiTheme="majorHAnsi" w:eastAsiaTheme="majorEastAsia" w:hAnsiTheme="majorHAnsi" w:cstheme="majorBidi"/>
+        <w:rFonts w:hAnsi="Noto Serif" w:ascii="Noto Serif" w:eastAsiaTheme="majorEastAsia" w:cstheme="majorBidi"/>
         <w:b/>
         <w:bCs/>
       </w:rPr>
@@ -4482,7 +4482,7 @@
         <w:spacing w:before="0" w:after="0" w:line="240" w:lineRule="auto"/>
       </w:pPr>
       <w:rPr>
-        <w:rFonts w:asciiTheme="majorHAnsi" w:eastAsiaTheme="majorEastAsia" w:hAnsiTheme="majorHAnsi" w:cstheme="majorBidi"/>
+        <w:rFonts w:hAnsi="Noto Serif" w:ascii="Noto Serif" w:eastAsiaTheme="majorEastAsia" w:cstheme="majorBidi"/>
         <w:b/>
         <w:bCs/>
       </w:rPr>
@@ -4503,7 +4503,7 @@
         <w:spacing w:before="0" w:after="0" w:line="240" w:lineRule="auto"/>
       </w:pPr>
       <w:rPr>
-        <w:rFonts w:asciiTheme="majorHAnsi" w:eastAsiaTheme="majorEastAsia" w:hAnsiTheme="majorHAnsi" w:cstheme="majorBidi"/>
+        <w:rFonts w:hAnsi="Noto Serif" w:ascii="Noto Serif" w:eastAsiaTheme="majorEastAsia" w:cstheme="majorBidi"/>
         <w:b/>
         <w:bCs/>
       </w:rPr>
@@ -4521,14 +4521,14 @@
     </w:tblStylePr>
     <w:tblStylePr w:type="firstCol">
       <w:rPr>
-        <w:rFonts w:asciiTheme="majorHAnsi" w:eastAsiaTheme="majorEastAsia" w:hAnsiTheme="majorHAnsi" w:cstheme="majorBidi"/>
+        <w:rFonts w:hAnsi="Noto Serif" w:ascii="Noto Serif" w:eastAsiaTheme="majorEastAsia" w:cstheme="majorBidi"/>
         <w:b/>
         <w:bCs/>
       </w:rPr>
     </w:tblStylePr>
     <w:tblStylePr w:type="lastCol">
       <w:rPr>
-        <w:rFonts w:asciiTheme="majorHAnsi" w:eastAsiaTheme="majorEastAsia" w:hAnsiTheme="majorHAnsi" w:cstheme="majorBidi"/>
+        <w:rFonts w:hAnsi="Noto Serif" w:ascii="Noto Serif" w:eastAsiaTheme="majorEastAsia" w:cstheme="majorBidi"/>
         <w:b/>
         <w:bCs/>
       </w:rPr>
@@ -4612,7 +4612,7 @@
         <w:spacing w:before="0" w:after="0" w:line="240" w:lineRule="auto"/>
       </w:pPr>
       <w:rPr>
-        <w:rFonts w:asciiTheme="majorHAnsi" w:eastAsiaTheme="majorEastAsia" w:hAnsiTheme="majorHAnsi" w:cstheme="majorBidi"/>
+        <w:rFonts w:hAnsi="Noto Serif" w:ascii="Noto Serif" w:eastAsiaTheme="majorEastAsia" w:cstheme="majorBidi"/>
         <w:b/>
         <w:bCs/>
       </w:rPr>
@@ -4633,7 +4633,7 @@
         <w:spacing w:before="0" w:after="0" w:line="240" w:lineRule="auto"/>
       </w:pPr>
       <w:rPr>
-        <w:rFonts w:asciiTheme="majorHAnsi" w:eastAsiaTheme="majorEastAsia" w:hAnsiTheme="majorHAnsi" w:cstheme="majorBidi"/>
+        <w:rFonts w:hAnsi="Noto Serif" w:ascii="Noto Serif" w:eastAsiaTheme="majorEastAsia" w:cstheme="majorBidi"/>
         <w:b/>
         <w:bCs/>
       </w:rPr>
@@ -4651,14 +4651,14 @@
     </w:tblStylePr>
     <w:tblStylePr w:type="firstCol">
       <w:rPr>
-        <w:rFonts w:asciiTheme="majorHAnsi" w:eastAsiaTheme="majorEastAsia" w:hAnsiTheme="majorHAnsi" w:cstheme="majorBidi"/>
+        <w:rFonts w:hAnsi="Noto Serif" w:ascii="Noto Serif" w:eastAsiaTheme="majorEastAsia" w:cstheme="majorBidi"/>
         <w:b/>
         <w:bCs/>
       </w:rPr>
     </w:tblStylePr>
     <w:tblStylePr w:type="lastCol">
       <w:rPr>
-        <w:rFonts w:asciiTheme="majorHAnsi" w:eastAsiaTheme="majorEastAsia" w:hAnsiTheme="majorHAnsi" w:cstheme="majorBidi"/>
+        <w:rFonts w:hAnsi="Noto Serif" w:ascii="Noto Serif" w:eastAsiaTheme="majorEastAsia" w:cstheme="majorBidi"/>
         <w:b/>
         <w:bCs/>
       </w:rPr>
@@ -6523,7 +6523,7 @@
     </w:tblPr>
     <w:tblStylePr w:type="firstRow">
       <w:rPr>
-        <w:rFonts w:asciiTheme="majorHAnsi" w:eastAsiaTheme="majorEastAsia" w:hAnsiTheme="majorHAnsi" w:cstheme="majorBidi"/>
+        <w:rFonts w:hAnsi="Noto Serif" w:ascii="Noto Serif" w:eastAsiaTheme="majorEastAsia" w:cstheme="majorBidi"/>
       </w:rPr>
       <w:tblPr/>
       <w:tcPr>
@@ -6607,7 +6607,7 @@
     </w:tblPr>
     <w:tblStylePr w:type="firstRow">
       <w:rPr>
-        <w:rFonts w:asciiTheme="majorHAnsi" w:eastAsiaTheme="majorEastAsia" w:hAnsiTheme="majorHAnsi" w:cstheme="majorBidi"/>
+        <w:rFonts w:hAnsi="Noto Serif" w:ascii="Noto Serif" w:eastAsiaTheme="majorEastAsia" w:cstheme="majorBidi"/>
       </w:rPr>
       <w:tblPr/>
       <w:tcPr>
@@ -6691,7 +6691,7 @@
     </w:tblPr>
     <w:tblStylePr w:type="firstRow">
       <w:rPr>
-        <w:rFonts w:asciiTheme="majorHAnsi" w:eastAsiaTheme="majorEastAsia" w:hAnsiTheme="majorHAnsi" w:cstheme="majorBidi"/>
+        <w:rFonts w:hAnsi="Noto Serif" w:ascii="Noto Serif" w:eastAsiaTheme="majorEastAsia" w:cstheme="majorBidi"/>
       </w:rPr>
       <w:tblPr/>
       <w:tcPr>
@@ -6775,7 +6775,7 @@
     </w:tblPr>
     <w:tblStylePr w:type="firstRow">
       <w:rPr>
-        <w:rFonts w:asciiTheme="majorHAnsi" w:eastAsiaTheme="majorEastAsia" w:hAnsiTheme="majorHAnsi" w:cstheme="majorBidi"/>
+        <w:rFonts w:hAnsi="Noto Serif" w:ascii="Noto Serif" w:eastAsiaTheme="majorEastAsia" w:cstheme="majorBidi"/>
       </w:rPr>
       <w:tblPr/>
       <w:tcPr>
@@ -6859,7 +6859,7 @@
     </w:tblPr>
     <w:tblStylePr w:type="firstRow">
       <w:rPr>
-        <w:rFonts w:asciiTheme="majorHAnsi" w:eastAsiaTheme="majorEastAsia" w:hAnsiTheme="majorHAnsi" w:cstheme="majorBidi"/>
+        <w:rFonts w:hAnsi="Noto Serif" w:ascii="Noto Serif" w:eastAsiaTheme="majorEastAsia" w:cstheme="majorBidi"/>
       </w:rPr>
       <w:tblPr/>
       <w:tcPr>
@@ -6943,7 +6943,7 @@
     </w:tblPr>
     <w:tblStylePr w:type="firstRow">
       <w:rPr>
-        <w:rFonts w:asciiTheme="majorHAnsi" w:eastAsiaTheme="majorEastAsia" w:hAnsiTheme="majorHAnsi" w:cstheme="majorBidi"/>
+        <w:rFonts w:hAnsi="Noto Serif" w:ascii="Noto Serif" w:eastAsiaTheme="majorEastAsia" w:cstheme="majorBidi"/>
       </w:rPr>
       <w:tblPr/>
       <w:tcPr>
@@ -7027,7 +7027,7 @@
     </w:tblPr>
     <w:tblStylePr w:type="firstRow">
       <w:rPr>
-        <w:rFonts w:asciiTheme="majorHAnsi" w:eastAsiaTheme="majorEastAsia" w:hAnsiTheme="majorHAnsi" w:cstheme="majorBidi"/>
+        <w:rFonts w:hAnsi="Noto Serif" w:ascii="Noto Serif" w:eastAsiaTheme="majorEastAsia" w:cstheme="majorBidi"/>
       </w:rPr>
       <w:tblPr/>
       <w:tcPr>
@@ -7092,7 +7092,7 @@
       <w:spacing w:after="0" w:line="240" w:lineRule="auto"/>
     </w:pPr>
     <w:rPr>
-      <w:rFonts w:asciiTheme="majorHAnsi" w:eastAsiaTheme="majorEastAsia" w:hAnsiTheme="majorHAnsi" w:cstheme="majorBidi"/>
+      <w:rFonts w:hAnsi="Noto Serif" w:ascii="Noto Serif" w:eastAsiaTheme="majorEastAsia" w:cstheme="majorBidi"/>
       <w:color w:val="000000" w:themeColor="text1"/>
     </w:rPr>
     <w:tblPr>
@@ -7220,7 +7220,7 @@
       <w:spacing w:after="0" w:line="240" w:lineRule="auto"/>
     </w:pPr>
     <w:rPr>
-      <w:rFonts w:asciiTheme="majorHAnsi" w:eastAsiaTheme="majorEastAsia" w:hAnsiTheme="majorHAnsi" w:cstheme="majorBidi"/>
+      <w:rFonts w:hAnsi="Noto Serif" w:ascii="Noto Serif" w:eastAsiaTheme="majorEastAsia" w:cstheme="majorBidi"/>
       <w:color w:val="000000" w:themeColor="text1"/>
     </w:rPr>
     <w:tblPr>
@@ -7348,7 +7348,7 @@
       <w:spacing w:after="0" w:line="240" w:lineRule="auto"/>
     </w:pPr>
     <w:rPr>
-      <w:rFonts w:asciiTheme="majorHAnsi" w:eastAsiaTheme="majorEastAsia" w:hAnsiTheme="majorHAnsi" w:cstheme="majorBidi"/>
+      <w:rFonts w:hAnsi="Noto Serif" w:ascii="Noto Serif" w:eastAsiaTheme="majorEastAsia" w:cstheme="majorBidi"/>
       <w:color w:val="000000" w:themeColor="text1"/>
     </w:rPr>
     <w:tblPr>
@@ -7476,7 +7476,7 @@
       <w:spacing w:after="0" w:line="240" w:lineRule="auto"/>
     </w:pPr>
     <w:rPr>
-      <w:rFonts w:asciiTheme="majorHAnsi" w:eastAsiaTheme="majorEastAsia" w:hAnsiTheme="majorHAnsi" w:cstheme="majorBidi"/>
+      <w:rFonts w:hAnsi="Noto Serif" w:ascii="Noto Serif" w:eastAsiaTheme="majorEastAsia" w:cstheme="majorBidi"/>
       <w:color w:val="000000" w:themeColor="text1"/>
     </w:rPr>
     <w:tblPr>
@@ -7604,7 +7604,7 @@
       <w:spacing w:after="0" w:line="240" w:lineRule="auto"/>
     </w:pPr>
     <w:rPr>
-      <w:rFonts w:asciiTheme="majorHAnsi" w:eastAsiaTheme="majorEastAsia" w:hAnsiTheme="majorHAnsi" w:cstheme="majorBidi"/>
+      <w:rFonts w:hAnsi="Noto Serif" w:ascii="Noto Serif" w:eastAsiaTheme="majorEastAsia" w:cstheme="majorBidi"/>
       <w:color w:val="000000" w:themeColor="text1"/>
     </w:rPr>
     <w:tblPr>
@@ -7732,7 +7732,7 @@
       <w:spacing w:after="0" w:line="240" w:lineRule="auto"/>
     </w:pPr>
     <w:rPr>
-      <w:rFonts w:asciiTheme="majorHAnsi" w:eastAsiaTheme="majorEastAsia" w:hAnsiTheme="majorHAnsi" w:cstheme="majorBidi"/>
+      <w:rFonts w:hAnsi="Noto Serif" w:ascii="Noto Serif" w:eastAsiaTheme="majorEastAsia" w:cstheme="majorBidi"/>
       <w:color w:val="000000" w:themeColor="text1"/>
     </w:rPr>
     <w:tblPr>
@@ -7860,7 +7860,7 @@
       <w:spacing w:after="0" w:line="240" w:lineRule="auto"/>
     </w:pPr>
     <w:rPr>
-      <w:rFonts w:asciiTheme="majorHAnsi" w:eastAsiaTheme="majorEastAsia" w:hAnsiTheme="majorHAnsi" w:cstheme="majorBidi"/>
+      <w:rFonts w:hAnsi="Noto Serif" w:ascii="Noto Serif" w:eastAsiaTheme="majorEastAsia" w:cstheme="majorBidi"/>
       <w:color w:val="000000" w:themeColor="text1"/>
     </w:rPr>
     <w:tblPr>
@@ -8499,7 +8499,7 @@
       <w:spacing w:after="0" w:line="240" w:lineRule="auto"/>
     </w:pPr>
     <w:rPr>
-      <w:rFonts w:asciiTheme="majorHAnsi" w:eastAsiaTheme="majorEastAsia" w:hAnsiTheme="majorHAnsi" w:cstheme="majorBidi"/>
+      <w:rFonts w:hAnsi="Noto Serif" w:ascii="Noto Serif" w:eastAsiaTheme="majorEastAsia" w:cstheme="majorBidi"/>
       <w:color w:val="000000" w:themeColor="text1"/>
     </w:rPr>
     <w:tblPr>
@@ -8624,7 +8624,7 @@
       <w:spacing w:after="0" w:line="240" w:lineRule="auto"/>
     </w:pPr>
     <w:rPr>
-      <w:rFonts w:asciiTheme="majorHAnsi" w:eastAsiaTheme="majorEastAsia" w:hAnsiTheme="majorHAnsi" w:cstheme="majorBidi"/>
+      <w:rFonts w:hAnsi="Noto Serif" w:ascii="Noto Serif" w:eastAsiaTheme="majorEastAsia" w:cstheme="majorBidi"/>
       <w:color w:val="000000" w:themeColor="text1"/>
     </w:rPr>
     <w:tblPr>
@@ -8749,7 +8749,7 @@
       <w:spacing w:after="0" w:line="240" w:lineRule="auto"/>
     </w:pPr>
     <w:rPr>
-      <w:rFonts w:asciiTheme="majorHAnsi" w:eastAsiaTheme="majorEastAsia" w:hAnsiTheme="majorHAnsi" w:cstheme="majorBidi"/>
+      <w:rFonts w:hAnsi="Noto Serif" w:ascii="Noto Serif" w:eastAsiaTheme="majorEastAsia" w:cstheme="majorBidi"/>
       <w:color w:val="000000" w:themeColor="text1"/>
     </w:rPr>
     <w:tblPr>
@@ -8874,7 +8874,7 @@
       <w:spacing w:after="0" w:line="240" w:lineRule="auto"/>
     </w:pPr>
     <w:rPr>
-      <w:rFonts w:asciiTheme="majorHAnsi" w:eastAsiaTheme="majorEastAsia" w:hAnsiTheme="majorHAnsi" w:cstheme="majorBidi"/>
+      <w:rFonts w:hAnsi="Noto Serif" w:ascii="Noto Serif" w:eastAsiaTheme="majorEastAsia" w:cstheme="majorBidi"/>
       <w:color w:val="000000" w:themeColor="text1"/>
     </w:rPr>
     <w:tblPr>
@@ -8999,7 +8999,7 @@
       <w:spacing w:after="0" w:line="240" w:lineRule="auto"/>
     </w:pPr>
     <w:rPr>
-      <w:rFonts w:asciiTheme="majorHAnsi" w:eastAsiaTheme="majorEastAsia" w:hAnsiTheme="majorHAnsi" w:cstheme="majorBidi"/>
+      <w:rFonts w:hAnsi="Noto Serif" w:ascii="Noto Serif" w:eastAsiaTheme="majorEastAsia" w:cstheme="majorBidi"/>
       <w:color w:val="000000" w:themeColor="text1"/>
     </w:rPr>
     <w:tblPr>
@@ -9124,7 +9124,7 @@
       <w:spacing w:after="0" w:line="240" w:lineRule="auto"/>
     </w:pPr>
     <w:rPr>
-      <w:rFonts w:asciiTheme="majorHAnsi" w:eastAsiaTheme="majorEastAsia" w:hAnsiTheme="majorHAnsi" w:cstheme="majorBidi"/>
+      <w:rFonts w:hAnsi="Noto Serif" w:ascii="Noto Serif" w:eastAsiaTheme="majorEastAsia" w:cstheme="majorBidi"/>
       <w:color w:val="000000" w:themeColor="text1"/>
     </w:rPr>
     <w:tblPr>
@@ -9249,7 +9249,7 @@
       <w:spacing w:after="0" w:line="240" w:lineRule="auto"/>
     </w:pPr>
     <w:rPr>
-      <w:rFonts w:asciiTheme="majorHAnsi" w:eastAsiaTheme="majorEastAsia" w:hAnsiTheme="majorHAnsi" w:cstheme="majorBidi"/>
+      <w:rFonts w:hAnsi="Noto Serif" w:ascii="Noto Serif" w:eastAsiaTheme="majorEastAsia" w:cstheme="majorBidi"/>
       <w:color w:val="000000" w:themeColor="text1"/>
     </w:rPr>
     <w:tblPr>

</xml_diff>

<commit_message>
compiled case: print the institutes' real Kurdish names and keep each heading with its table
</commit_message>
<xml_diff>
--- a/backend/documents/letter_templates/case_summary.docx
+++ b/backend/documents/letter_templates/case_summary.docx
@@ -56,6 +56,7 @@
     </w:p>
     <w:p>
       <w:pPr>
+        <w:keepNext/>
         <w:bidi/>
       </w:pPr>
       <w:r>
@@ -69,6 +70,7 @@
     </w:p>
     <w:p>
       <w:pPr>
+        <w:keepNext/>
         <w:bidi/>
       </w:pPr>
       <w:r>
@@ -548,9 +550,14 @@
         </w:tc>
       </w:tr>
     </w:tbl>
-    <w:p/>
     <w:p>
       <w:pPr>
+        <w:keepNext/>
+      </w:pPr>
+    </w:p>
+    <w:p>
+      <w:pPr>
+        <w:keepNext/>
         <w:bidi/>
       </w:pPr>
       <w:r>
@@ -798,9 +805,14 @@
         </w:tc>
       </w:tr>
     </w:tbl>
-    <w:p/>
     <w:p>
       <w:pPr>
+        <w:keepNext/>
+      </w:pPr>
+    </w:p>
+    <w:p>
+      <w:pPr>
+        <w:keepNext/>
         <w:bidi/>
       </w:pPr>
       <w:r>

</xml_diff>

<commit_message>
processes: a case is opened in a category, and the compiled file names who closed it
</commit_message>
<xml_diff>
--- a/backend/documents/letter_templates/case_summary.docx
+++ b/backend/documents/letter_templates/case_summary.docx
@@ -431,6 +431,44 @@
                 <w:rtl/>
               </w:rPr>
               <w:t>{{ assigned_lawyer }}</w:t>
+            </w:r>
+          </w:p>
+        </w:tc>
+      </w:tr>
+      <w:tr>
+        <w:tc>
+          <w:tcPr>
+            <w:tcW w:type="dxa" w:w="4320"/>
+          </w:tcPr>
+          <w:p>
+            <w:pPr>
+              <w:bidi/>
+            </w:pPr>
+            <w:r>
+              <w:rPr>
+                <w:rFonts w:ascii="Noto Serif" w:hAnsi="Noto Serif" w:cs="Noto Naskh Arabic"/>
+                <w:sz w:val="20"/>
+                <w:rtl/>
+              </w:rPr>
+              <w:t xml:space="preserve">کۆتاییپێهێنەر</w:t>
+            </w:r>
+          </w:p>
+        </w:tc>
+        <w:tc>
+          <w:tcPr>
+            <w:tcW w:type="dxa" w:w="4320"/>
+          </w:tcPr>
+          <w:p>
+            <w:pPr>
+              <w:bidi/>
+            </w:pPr>
+            <w:r>
+              <w:rPr>
+                <w:rFonts w:ascii="Noto Serif" w:hAnsi="Noto Serif" w:cs="Noto Naskh Arabic"/>
+                <w:sz w:val="20"/>
+                <w:rtl/>
+              </w:rPr>
+              <w:t xml:space="preserve">{{ concluded_by }}</w:t>
             </w:r>
           </w:p>
         </w:tc>

</xml_diff>